<commit_message>
Cập nhật báo cáo và đường dẫn github
</commit_message>
<xml_diff>
--- a/BaoCao/Report_24521388_NguyenHoangPhuc.docx
+++ b/BaoCao/Report_24521388_NguyenHoangPhuc.docx
@@ -2497,6 +2497,84 @@
         </w:rPr>
         <w:t>ữ liệu thử nghiệm</w:t>
       </w:r>
+      <w:r>
+        <w:rPr>
+          <w:rFonts w:ascii="Times New Roman" w:hAnsi="Times New Roman" w:cs="Times New Roman"/>
+          <w:sz w:val="26"/>
+          <w:szCs w:val="26"/>
+        </w:rPr>
+        <w:t>: Do giới hạn Upload nên em xin phép để dưới dạng link trên Google Drive</w:t>
+      </w:r>
+    </w:p>
+    <w:p>
+      <w:pPr>
+        <w:rPr>
+          <w:rFonts w:ascii="Times New Roman" w:hAnsi="Times New Roman" w:cs="Times New Roman"/>
+          <w:sz w:val="26"/>
+          <w:szCs w:val="26"/>
+        </w:rPr>
+      </w:pPr>
+      <w:hyperlink r:id="rId9" w:history="1">
+        <w:r>
+          <w:rPr>
+            <w:rStyle w:val="Hyperlink"/>
+            <w:rFonts w:ascii="Times New Roman" w:hAnsi="Times New Roman" w:cs="Times New Roman"/>
+            <w:sz w:val="26"/>
+            <w:szCs w:val="26"/>
+          </w:rPr>
+          <w:t>https://drive.google.com/file/d/1nWzzsJ8fb54OL_ML4-SQaOkpXLILcY5r/view?usp=sharing</w:t>
+        </w:r>
+      </w:hyperlink>
+      <w:r>
+        <w:rPr>
+          <w:rFonts w:ascii="Times New Roman" w:hAnsi="Times New Roman" w:cs="Times New Roman"/>
+          <w:sz w:val="26"/>
+          <w:szCs w:val="26"/>
+        </w:rPr>
+        <w:tab/>
+      </w:r>
+    </w:p>
+    <w:p>
+      <w:pPr>
+        <w:pStyle w:val="ListParagraph"/>
+        <w:numPr>
+          <w:ilvl w:val="1"/>
+          <w:numId w:val="4"/>
+        </w:numPr>
+        <w:rPr>
+          <w:rFonts w:ascii="Times New Roman" w:hAnsi="Times New Roman" w:cs="Times New Roman"/>
+          <w:sz w:val="26"/>
+          <w:szCs w:val="26"/>
+        </w:rPr>
+      </w:pPr>
+      <w:r>
+        <w:rPr>
+          <w:rFonts w:ascii="Times New Roman" w:hAnsi="Times New Roman" w:cs="Times New Roman"/>
+          <w:sz w:val="26"/>
+          <w:szCs w:val="26"/>
+        </w:rPr>
+        <w:t xml:space="preserve">Link github: </w:t>
+      </w:r>
+    </w:p>
+    <w:p>
+      <w:pPr>
+        <w:rPr>
+          <w:rFonts w:ascii="Times New Roman" w:hAnsi="Times New Roman" w:cs="Times New Roman"/>
+          <w:sz w:val="26"/>
+          <w:szCs w:val="26"/>
+        </w:rPr>
+      </w:pPr>
+      <w:hyperlink r:id="rId10" w:history="1">
+        <w:r>
+          <w:rPr>
+            <w:rStyle w:val="Hyperlink"/>
+            <w:rFonts w:ascii="Times New Roman" w:hAnsi="Times New Roman" w:cs="Times New Roman"/>
+            <w:sz w:val="26"/>
+            <w:szCs w:val="26"/>
+          </w:rPr>
+          <w:t>Pau1zz7/BT_Tuan4_IT003: Thực nghiệm các thuật toán sắp xếp</w:t>
+        </w:r>
+      </w:hyperlink>
     </w:p>
     <w:sectPr>
       <w:pgSz w:w="11907" w:h="16839" w:code="9"/>
@@ -4270,6 +4348,29 @@
     <w:rsid w:val="008A682A"/>
     <w:rPr>
       <w:vertAlign w:val="superscript"/>
+    </w:rPr>
+  </w:style>
+  <w:style w:type="character" w:styleId="Hyperlink">
+    <w:name w:val="Hyperlink"/>
+    <w:basedOn w:val="DefaultParagraphFont"/>
+    <w:uiPriority w:val="99"/>
+    <w:unhideWhenUsed/>
+    <w:rsid w:val="001C7CAE"/>
+    <w:rPr>
+      <w:color w:val="0563C1" w:themeColor="hyperlink"/>
+      <w:u w:val="single"/>
+    </w:rPr>
+  </w:style>
+  <w:style w:type="character" w:styleId="UnresolvedMention">
+    <w:name w:val="Unresolved Mention"/>
+    <w:basedOn w:val="DefaultParagraphFont"/>
+    <w:uiPriority w:val="99"/>
+    <w:semiHidden/>
+    <w:unhideWhenUsed/>
+    <w:rsid w:val="001C7CAE"/>
+    <w:rPr>
+      <w:color w:val="605E5C"/>
+      <w:shd w:val="clear" w:color="auto" w:fill="E1DFDD"/>
     </w:rPr>
   </w:style>
 </w:styles>

</xml_diff>